<commit_message>
docs(reports): update link in reports to repo&website
</commit_message>
<xml_diff>
--- a/reports/Отчет_учебной_практики_rag-mobile.docx
+++ b/reports/Отчет_учебной_практики_rag-mobile.docx
@@ -458,7 +458,7 @@
       <w:r>
         <w:fldChar w:fldCharType="separate"/>
       </w:r>
-      <w:hyperlink w:anchor="_Toc232179704" w:history="1">
+      <w:hyperlink w:anchor="_Toc232342765" w:history="1">
         <w:r>
           <w:rPr>
             <w:rStyle w:val="a5"/>
@@ -485,7 +485,7 @@
             <w:noProof/>
             <w:webHidden/>
           </w:rPr>
-          <w:instrText xml:space="preserve"> PAGEREF _Toc232179704 \h </w:instrText>
+          <w:instrText xml:space="preserve"> PAGEREF _Toc232342765 \h </w:instrText>
         </w:r>
         <w:r>
           <w:rPr>
@@ -531,7 +531,7 @@
           <w14:ligatures w14:val="standardContextual"/>
         </w:rPr>
       </w:pPr>
-      <w:hyperlink w:anchor="_Toc232179705" w:history="1">
+      <w:hyperlink w:anchor="_Toc232342766" w:history="1">
         <w:r>
           <w:rPr>
             <w:rStyle w:val="a5"/>
@@ -558,7 +558,7 @@
             <w:noProof/>
             <w:webHidden/>
           </w:rPr>
-          <w:instrText xml:space="preserve"> PAGEREF _Toc232179705 \h </w:instrText>
+          <w:instrText xml:space="preserve"> PAGEREF _Toc232342766 \h </w:instrText>
         </w:r>
         <w:r>
           <w:rPr>
@@ -604,7 +604,7 @@
           <w14:ligatures w14:val="standardContextual"/>
         </w:rPr>
       </w:pPr>
-      <w:hyperlink w:anchor="_Toc232179706" w:history="1">
+      <w:hyperlink w:anchor="_Toc232342767" w:history="1">
         <w:r>
           <w:rPr>
             <w:rStyle w:val="a5"/>
@@ -639,7 +639,7 @@
             <w:noProof/>
             <w:webHidden/>
           </w:rPr>
-          <w:instrText xml:space="preserve"> PAGEREF _Toc232179706 \h </w:instrText>
+          <w:instrText xml:space="preserve"> PAGEREF _Toc232342767 \h </w:instrText>
         </w:r>
         <w:r>
           <w:rPr>
@@ -685,21 +685,27 @@
           <w14:ligatures w14:val="standardContextual"/>
         </w:rPr>
       </w:pPr>
-      <w:hyperlink w:anchor="_Toc232179707" w:history="1">
+      <w:hyperlink w:anchor="_Toc232342768" w:history="1">
         <w:r>
           <w:rPr>
             <w:rStyle w:val="a5"/>
             <w:noProof/>
           </w:rPr>
-          <w:t xml:space="preserve">Репозиторий: </w:t>
+          <w:t>Репозиторий: на</w:t>
         </w:r>
         <w:r>
           <w:rPr>
             <w:rStyle w:val="a5"/>
-            <w:bCs/>
-            <w:noProof/>
-          </w:rPr>
-          <w:t>Здесь когда нибудь будет ссылка на нашу репку</w:t>
+            <w:noProof/>
+          </w:rPr>
+          <w:t>ж</w:t>
+        </w:r>
+        <w:r>
+          <w:rPr>
+            <w:rStyle w:val="a5"/>
+            <w:noProof/>
+          </w:rPr>
+          <w:t>мите на меня</w:t>
         </w:r>
         <w:r>
           <w:rPr>
@@ -720,7 +726,7 @@
             <w:noProof/>
             <w:webHidden/>
           </w:rPr>
-          <w:instrText xml:space="preserve"> PAGEREF _Toc232179707 \h </w:instrText>
+          <w:instrText xml:space="preserve"> PAGEREF _Toc232342768 \h </w:instrText>
         </w:r>
         <w:r>
           <w:rPr>
@@ -766,13 +772,13 @@
           <w14:ligatures w14:val="standardContextual"/>
         </w:rPr>
       </w:pPr>
-      <w:hyperlink w:anchor="_Toc232179708" w:history="1">
+      <w:hyperlink w:anchor="_Toc232342769" w:history="1">
         <w:r>
           <w:rPr>
             <w:rStyle w:val="a5"/>
             <w:noProof/>
           </w:rPr>
-          <w:t>Цель проекта</w:t>
+          <w:t>Ссылка на сайт: нажмите на меня</w:t>
         </w:r>
         <w:r>
           <w:rPr>
@@ -793,7 +799,7 @@
             <w:noProof/>
             <w:webHidden/>
           </w:rPr>
-          <w:instrText xml:space="preserve"> PAGEREF _Toc232179708 \h </w:instrText>
+          <w:instrText xml:space="preserve"> PAGEREF _Toc232342769 \h </w:instrText>
         </w:r>
         <w:r>
           <w:rPr>
@@ -839,12 +845,85 @@
           <w14:ligatures w14:val="standardContextual"/>
         </w:rPr>
       </w:pPr>
-      <w:hyperlink w:anchor="_Toc232179709" w:history="1">
+      <w:hyperlink w:anchor="_Toc232342770" w:history="1">
         <w:r>
           <w:rPr>
             <w:rStyle w:val="a5"/>
             <w:noProof/>
           </w:rPr>
+          <w:t>Цель проекта</w:t>
+        </w:r>
+        <w:r>
+          <w:rPr>
+            <w:noProof/>
+            <w:webHidden/>
+          </w:rPr>
+          <w:tab/>
+        </w:r>
+        <w:r>
+          <w:rPr>
+            <w:noProof/>
+            <w:webHidden/>
+          </w:rPr>
+          <w:fldChar w:fldCharType="begin"/>
+        </w:r>
+        <w:r>
+          <w:rPr>
+            <w:noProof/>
+            <w:webHidden/>
+          </w:rPr>
+          <w:instrText xml:space="preserve"> PAGEREF _Toc232342770 \h </w:instrText>
+        </w:r>
+        <w:r>
+          <w:rPr>
+            <w:noProof/>
+            <w:webHidden/>
+          </w:rPr>
+        </w:r>
+        <w:r>
+          <w:rPr>
+            <w:noProof/>
+            <w:webHidden/>
+          </w:rPr>
+          <w:fldChar w:fldCharType="separate"/>
+        </w:r>
+        <w:r>
+          <w:rPr>
+            <w:noProof/>
+            <w:webHidden/>
+          </w:rPr>
+          <w:t>3</w:t>
+        </w:r>
+        <w:r>
+          <w:rPr>
+            <w:noProof/>
+            <w:webHidden/>
+          </w:rPr>
+          <w:fldChar w:fldCharType="end"/>
+        </w:r>
+      </w:hyperlink>
+    </w:p>
+    <w:p>
+      <w:pPr>
+        <w:pStyle w:val="20"/>
+        <w:tabs>
+          <w:tab w:val="right" w:leader="underscore" w:pos="9344"/>
+        </w:tabs>
+        <w:rPr>
+          <w:rFonts w:asciiTheme="minorHAnsi" w:eastAsiaTheme="minorEastAsia" w:hAnsiTheme="minorHAnsi" w:cstheme="minorBidi"/>
+          <w:iCs w:val="0"/>
+          <w:noProof/>
+          <w:kern w:val="2"/>
+          <w:szCs w:val="24"/>
+          <w14:ligatures w14:val="standardContextual"/>
+        </w:rPr>
+      </w:pPr>
+      <w:hyperlink w:anchor="_Toc232342771" w:history="1">
+        <w:r>
+          <w:rPr>
+            <w:rStyle w:val="a5"/>
+            <w:noProof/>
+          </w:rPr>
           <w:t>Задачи проекта</w:t>
         </w:r>
         <w:r>
@@ -866,7 +945,7 @@
             <w:noProof/>
             <w:webHidden/>
           </w:rPr>
-          <w:instrText xml:space="preserve"> PAGEREF _Toc232179709 \h </w:instrText>
+          <w:instrText xml:space="preserve"> PAGEREF _Toc232342771 \h </w:instrText>
         </w:r>
         <w:r>
           <w:rPr>
@@ -914,7 +993,7 @@
           <w14:ligatures w14:val="standardContextual"/>
         </w:rPr>
       </w:pPr>
-      <w:hyperlink w:anchor="_Toc232179710" w:history="1">
+      <w:hyperlink w:anchor="_Toc232342772" w:history="1">
         <w:r>
           <w:rPr>
             <w:rStyle w:val="a5"/>
@@ -941,7 +1020,7 @@
             <w:noProof/>
             <w:webHidden/>
           </w:rPr>
-          <w:instrText xml:space="preserve"> PAGEREF _Toc232179710 \h </w:instrText>
+          <w:instrText xml:space="preserve"> PAGEREF _Toc232342772 \h </w:instrText>
         </w:r>
         <w:r>
           <w:rPr>
@@ -989,7 +1068,7 @@
           <w14:ligatures w14:val="standardContextual"/>
         </w:rPr>
       </w:pPr>
-      <w:hyperlink w:anchor="_Toc232179711" w:history="1">
+      <w:hyperlink w:anchor="_Toc232342773" w:history="1">
         <w:r>
           <w:rPr>
             <w:rStyle w:val="a5"/>
@@ -1016,7 +1095,7 @@
             <w:noProof/>
             <w:webHidden/>
           </w:rPr>
-          <w:instrText xml:space="preserve"> PAGEREF _Toc232179711 \h </w:instrText>
+          <w:instrText xml:space="preserve"> PAGEREF _Toc232342773 \h </w:instrText>
         </w:r>
         <w:r>
           <w:rPr>
@@ -1062,7 +1141,7 @@
           <w14:ligatures w14:val="standardContextual"/>
         </w:rPr>
       </w:pPr>
-      <w:hyperlink w:anchor="_Toc232179712" w:history="1">
+      <w:hyperlink w:anchor="_Toc232342774" w:history="1">
         <w:r>
           <w:rPr>
             <w:rStyle w:val="a5"/>
@@ -1097,7 +1176,7 @@
             <w:noProof/>
             <w:webHidden/>
           </w:rPr>
-          <w:instrText xml:space="preserve"> PAGEREF _Toc232179712 \h </w:instrText>
+          <w:instrText xml:space="preserve"> PAGEREF _Toc232342774 \h </w:instrText>
         </w:r>
         <w:r>
           <w:rPr>
@@ -1143,7 +1222,7 @@
           <w14:ligatures w14:val="standardContextual"/>
         </w:rPr>
       </w:pPr>
-      <w:hyperlink w:anchor="_Toc232179713" w:history="1">
+      <w:hyperlink w:anchor="_Toc232342775" w:history="1">
         <w:r>
           <w:rPr>
             <w:rStyle w:val="a5"/>
@@ -1178,7 +1257,7 @@
             <w:noProof/>
             <w:webHidden/>
           </w:rPr>
-          <w:instrText xml:space="preserve"> PAGEREF _Toc232179713 \h </w:instrText>
+          <w:instrText xml:space="preserve"> PAGEREF _Toc232342775 \h </w:instrText>
         </w:r>
         <w:r>
           <w:rPr>
@@ -1224,7 +1303,7 @@
           <w14:ligatures w14:val="standardContextual"/>
         </w:rPr>
       </w:pPr>
-      <w:hyperlink w:anchor="_Toc232179714" w:history="1">
+      <w:hyperlink w:anchor="_Toc232342776" w:history="1">
         <w:r>
           <w:rPr>
             <w:rStyle w:val="a5"/>
@@ -1251,7 +1330,7 @@
             <w:noProof/>
             <w:webHidden/>
           </w:rPr>
-          <w:instrText xml:space="preserve"> PAGEREF _Toc232179714 \h </w:instrText>
+          <w:instrText xml:space="preserve"> PAGEREF _Toc232342776 \h </w:instrText>
         </w:r>
         <w:r>
           <w:rPr>
@@ -1299,7 +1378,7 @@
           <w14:ligatures w14:val="standardContextual"/>
         </w:rPr>
       </w:pPr>
-      <w:hyperlink w:anchor="_Toc232179715" w:history="1">
+      <w:hyperlink w:anchor="_Toc232342777" w:history="1">
         <w:r>
           <w:rPr>
             <w:rStyle w:val="a5"/>
@@ -1326,7 +1405,7 @@
             <w:noProof/>
             <w:webHidden/>
           </w:rPr>
-          <w:instrText xml:space="preserve"> PAGEREF _Toc232179715 \h </w:instrText>
+          <w:instrText xml:space="preserve"> PAGEREF _Toc232342777 \h </w:instrText>
         </w:r>
         <w:r>
           <w:rPr>
@@ -1372,7 +1451,7 @@
           <w14:ligatures w14:val="standardContextual"/>
         </w:rPr>
       </w:pPr>
-      <w:hyperlink w:anchor="_Toc232179716" w:history="1">
+      <w:hyperlink w:anchor="_Toc232342778" w:history="1">
         <w:r>
           <w:rPr>
             <w:rStyle w:val="a5"/>
@@ -1399,7 +1478,7 @@
             <w:noProof/>
             <w:webHidden/>
           </w:rPr>
-          <w:instrText xml:space="preserve"> PAGEREF _Toc232179716 \h </w:instrText>
+          <w:instrText xml:space="preserve"> PAGEREF _Toc232342778 \h </w:instrText>
         </w:r>
         <w:r>
           <w:rPr>
@@ -1445,7 +1524,7 @@
           <w14:ligatures w14:val="standardContextual"/>
         </w:rPr>
       </w:pPr>
-      <w:hyperlink w:anchor="_Toc232179717" w:history="1">
+      <w:hyperlink w:anchor="_Toc232342779" w:history="1">
         <w:r>
           <w:rPr>
             <w:rStyle w:val="a5"/>
@@ -1472,7 +1551,7 @@
             <w:noProof/>
             <w:webHidden/>
           </w:rPr>
-          <w:instrText xml:space="preserve"> PAGEREF _Toc232179717 \h </w:instrText>
+          <w:instrText xml:space="preserve"> PAGEREF _Toc232342779 \h </w:instrText>
         </w:r>
         <w:r>
           <w:rPr>
@@ -1520,7 +1599,7 @@
           <w14:ligatures w14:val="standardContextual"/>
         </w:rPr>
       </w:pPr>
-      <w:hyperlink w:anchor="_Toc232179718" w:history="1">
+      <w:hyperlink w:anchor="_Toc232342780" w:history="1">
         <w:r>
           <w:rPr>
             <w:rStyle w:val="a5"/>
@@ -1547,7 +1626,7 @@
             <w:noProof/>
             <w:webHidden/>
           </w:rPr>
-          <w:instrText xml:space="preserve"> PAGEREF _Toc232179718 \h </w:instrText>
+          <w:instrText xml:space="preserve"> PAGEREF _Toc232342780 \h </w:instrText>
         </w:r>
         <w:r>
           <w:rPr>
@@ -1595,7 +1674,7 @@
           <w14:ligatures w14:val="standardContextual"/>
         </w:rPr>
       </w:pPr>
-      <w:hyperlink w:anchor="_Toc232179719" w:history="1">
+      <w:hyperlink w:anchor="_Toc232342781" w:history="1">
         <w:r>
           <w:rPr>
             <w:rStyle w:val="a5"/>
@@ -1622,7 +1701,7 @@
             <w:noProof/>
             <w:webHidden/>
           </w:rPr>
-          <w:instrText xml:space="preserve"> PAGEREF _Toc232179719 \h </w:instrText>
+          <w:instrText xml:space="preserve"> PAGEREF _Toc232342781 \h </w:instrText>
         </w:r>
         <w:r>
           <w:rPr>
@@ -1668,7 +1747,7 @@
       <w:r>
         <w:br w:type="column"/>
       </w:r>
-      <w:bookmarkStart w:id="0" w:name="_Toc232179704"/>
+      <w:bookmarkStart w:id="0" w:name="_Toc232342765"/>
       <w:r>
         <w:lastRenderedPageBreak/>
         <w:t>Введение</w:t>
@@ -1679,7 +1758,7 @@
       <w:pPr>
         <w:pStyle w:val="ad"/>
       </w:pPr>
-      <w:bookmarkStart w:id="1" w:name="_Toc232179705"/>
+      <w:bookmarkStart w:id="1" w:name="_Toc232342766"/>
       <w:r>
         <w:t>Общая информация о проекте</w:t>
       </w:r>
@@ -1694,7 +1773,7 @@
       <w:pPr>
         <w:pStyle w:val="ae"/>
       </w:pPr>
-      <w:bookmarkStart w:id="2" w:name="_Toc232179706"/>
+      <w:bookmarkStart w:id="2" w:name="_Toc232342767"/>
       <w:r>
         <w:t xml:space="preserve">Название проекта: </w:t>
       </w:r>
@@ -1709,67 +1788,116 @@
     </w:p>
     <w:p>
       <w:pPr>
-        <w:pStyle w:val="ae"/>
-        <w:outlineLvl w:val="0"/>
-        <w:rPr>
-          <w:b w:val="0"/>
-          <w:bCs/>
-        </w:rPr>
-      </w:pPr>
-      <w:bookmarkStart w:id="3" w:name="_Toc232179707"/>
+        <w:pStyle w:val="ad"/>
+        <w:jc w:val="left"/>
+      </w:pPr>
+      <w:bookmarkStart w:id="3" w:name="_Toc232342768"/>
       <w:r>
         <w:t xml:space="preserve">Репозиторий: </w:t>
       </w:r>
-      <w:bookmarkEnd w:id="3"/>
-      <w:r>
-        <w:fldChar w:fldCharType="begin"/>
-      </w:r>
-      <w:r>
-        <w:instrText>HYPERLINK "https://github.com/Jariik1/RAG-MobileApp.git"</w:instrText>
-      </w:r>
-      <w:r>
-        <w:fldChar w:fldCharType="separate"/>
-      </w:r>
-      <w:r>
-        <w:rPr>
-          <w:rStyle w:val="a5"/>
-        </w:rPr>
-        <w:t>нажмите на меня</w:t>
-      </w:r>
-      <w:r>
-        <w:fldChar w:fldCharType="end"/>
-      </w:r>
-      <w:r>
-        <w:br/>
-      </w:r>
-      <w:r>
-        <w:t>Ссылка на сайт</w:t>
-      </w:r>
-      <w:r>
-        <w:t>:</w:t>
-      </w:r>
-      <w:r>
-        <w:t xml:space="preserve"> </w:t>
-      </w:r>
       <w:hyperlink r:id="rId9" w:history="1">
         <w:r>
           <w:rPr>
             <w:rStyle w:val="a5"/>
-          </w:rPr>
-          <w:t>нажмите н</w:t>
+            <w:color w:val="000000" w:themeColor="text1"/>
+            <w:u w:val="none"/>
+          </w:rPr>
+          <w:t>нажм</w:t>
         </w:r>
         <w:r>
           <w:rPr>
             <w:rStyle w:val="a5"/>
-          </w:rPr>
-          <w:t>а</w:t>
+            <w:color w:val="000000" w:themeColor="text1"/>
+            <w:u w:val="none"/>
+          </w:rPr>
+          <w:t>и</w:t>
         </w:r>
         <w:r>
           <w:rPr>
             <w:rStyle w:val="a5"/>
-          </w:rPr>
-          <w:t xml:space="preserve"> меня</w:t>
-        </w:r>
+            <w:color w:val="000000" w:themeColor="text1"/>
+            <w:u w:val="none"/>
+          </w:rPr>
+          <w:t>т</w:t>
+        </w:r>
+        <w:r>
+          <w:rPr>
+            <w:rStyle w:val="a5"/>
+            <w:color w:val="000000" w:themeColor="text1"/>
+            <w:u w:val="none"/>
+          </w:rPr>
+          <w:t>е</w:t>
+        </w:r>
+        <w:r>
+          <w:rPr>
+            <w:rStyle w:val="a5"/>
+            <w:color w:val="000000" w:themeColor="text1"/>
+            <w:u w:val="none"/>
+          </w:rPr>
+          <w:t xml:space="preserve"> </w:t>
+        </w:r>
+        <w:r>
+          <w:rPr>
+            <w:rStyle w:val="a5"/>
+            <w:color w:val="000000" w:themeColor="text1"/>
+            <w:u w:val="none"/>
+          </w:rPr>
+          <w:t>на</w:t>
+        </w:r>
+        <w:r>
+          <w:rPr>
+            <w:rStyle w:val="a5"/>
+            <w:color w:val="000000" w:themeColor="text1"/>
+            <w:u w:val="none"/>
+          </w:rPr>
+          <w:t xml:space="preserve"> </w:t>
+        </w:r>
+        <w:r>
+          <w:rPr>
+            <w:rStyle w:val="a5"/>
+            <w:color w:val="000000" w:themeColor="text1"/>
+            <w:u w:val="none"/>
+          </w:rPr>
+          <w:t>меня</w:t>
+        </w:r>
+        <w:bookmarkEnd w:id="3"/>
+      </w:hyperlink>
+    </w:p>
+    <w:p>
+      <w:pPr>
+        <w:pStyle w:val="ad"/>
+        <w:jc w:val="left"/>
+      </w:pPr>
+      <w:bookmarkStart w:id="4" w:name="_Toc232342769"/>
+      <w:r>
+        <w:t xml:space="preserve">Ссылка на сайт: </w:t>
+      </w:r>
+      <w:hyperlink r:id="rId10" w:history="1">
+        <w:r>
+          <w:rPr>
+            <w:rStyle w:val="a5"/>
+            <w:color w:val="000000" w:themeColor="text1"/>
+            <w:u w:val="none"/>
+          </w:rPr>
+          <w:t xml:space="preserve">нажмите </w:t>
+        </w:r>
+        <w:r>
+          <w:rPr>
+            <w:rStyle w:val="a5"/>
+            <w:color w:val="000000" w:themeColor="text1"/>
+            <w:u w:val="none"/>
+          </w:rPr>
+          <w:t>н</w:t>
+        </w:r>
+        <w:r>
+          <w:rPr>
+            <w:rStyle w:val="a5"/>
+            <w:color w:val="000000" w:themeColor="text1"/>
+            <w:u w:val="none"/>
+          </w:rPr>
+          <w:t>а меня</w:t>
+        </w:r>
+        <w:bookmarkEnd w:id="4"/>
       </w:hyperlink>
     </w:p>
     <w:p>
@@ -1778,11 +1906,11 @@
         <w:spacing w:before="240" w:after="240"/>
         <w:jc w:val="center"/>
       </w:pPr>
-      <w:bookmarkStart w:id="4" w:name="_Toc232179708"/>
+      <w:bookmarkStart w:id="5" w:name="_Toc232342770"/>
       <w:r>
         <w:t>Цель проекта</w:t>
       </w:r>
-      <w:bookmarkEnd w:id="4"/>
+      <w:bookmarkEnd w:id="5"/>
     </w:p>
     <w:p>
       <w:pPr>
@@ -1889,11 +2017,11 @@
         <w:spacing w:before="240" w:after="240"/>
         <w:jc w:val="center"/>
       </w:pPr>
-      <w:bookmarkStart w:id="5" w:name="_Toc232179709"/>
+      <w:bookmarkStart w:id="6" w:name="_Toc232342771"/>
       <w:r>
         <w:t>Задачи проекта</w:t>
       </w:r>
-      <w:bookmarkEnd w:id="5"/>
+      <w:bookmarkEnd w:id="6"/>
     </w:p>
     <w:p>
       <w:pPr>
@@ -1990,11 +2118,11 @@
         <w:pStyle w:val="ac"/>
         <w:spacing w:before="240"/>
       </w:pPr>
-      <w:bookmarkStart w:id="6" w:name="_Toc232179710"/>
+      <w:bookmarkStart w:id="7" w:name="_Toc232342772"/>
       <w:r>
         <w:t>Описание задания по проектной практике</w:t>
       </w:r>
-      <w:bookmarkEnd w:id="6"/>
+      <w:bookmarkEnd w:id="7"/>
     </w:p>
     <w:p>
       <w:pPr>
@@ -2214,18 +2342,18 @@
       <w:pPr>
         <w:pStyle w:val="ac"/>
       </w:pPr>
-      <w:bookmarkStart w:id="7" w:name="_Toc232179711"/>
+      <w:bookmarkStart w:id="8" w:name="_Toc232342773"/>
       <w:r>
         <w:t>Описание достигнутых результатов по проектной практике</w:t>
       </w:r>
-      <w:bookmarkEnd w:id="7"/>
+      <w:bookmarkEnd w:id="8"/>
     </w:p>
     <w:p>
       <w:pPr>
         <w:pStyle w:val="ad"/>
         <w:spacing w:after="240"/>
       </w:pPr>
-      <w:bookmarkStart w:id="8" w:name="_Toc232179712"/>
+      <w:bookmarkStart w:id="9" w:name="_Toc232342774"/>
       <w:r>
         <w:t xml:space="preserve">Итоги работы с </w:t>
       </w:r>
@@ -2235,7 +2363,7 @@
         </w:rPr>
         <w:t>Git</w:t>
       </w:r>
-      <w:bookmarkEnd w:id="8"/>
+      <w:bookmarkEnd w:id="9"/>
     </w:p>
     <w:p>
       <w:pPr>
@@ -2454,7 +2582,7 @@
         <w:pStyle w:val="ad"/>
         <w:spacing w:before="240" w:after="240"/>
       </w:pPr>
-      <w:bookmarkStart w:id="9" w:name="_Toc232179713"/>
+      <w:bookmarkStart w:id="10" w:name="_Toc232342775"/>
       <w:r>
         <w:lastRenderedPageBreak/>
         <w:t xml:space="preserve">Итоги работы с </w:t>
@@ -2465,7 +2593,7 @@
         </w:rPr>
         <w:t>Markdown</w:t>
       </w:r>
-      <w:bookmarkEnd w:id="9"/>
+      <w:bookmarkEnd w:id="10"/>
     </w:p>
     <w:p>
       <w:pPr>
@@ -2597,14 +2725,14 @@
           <w:szCs w:val="28"/>
         </w:rPr>
       </w:pPr>
-      <w:bookmarkStart w:id="10" w:name="_Toc232179714"/>
+      <w:bookmarkStart w:id="11" w:name="_Toc232342776"/>
       <w:r>
         <w:rPr>
           <w:szCs w:val="28"/>
         </w:rPr>
         <w:t>Сайт</w:t>
       </w:r>
-      <w:bookmarkEnd w:id="10"/>
+      <w:bookmarkEnd w:id="11"/>
     </w:p>
     <w:p>
       <w:pPr>
@@ -2859,11 +2987,11 @@
       <w:pPr>
         <w:pStyle w:val="ac"/>
       </w:pPr>
-      <w:bookmarkStart w:id="11" w:name="_Toc232179715"/>
+      <w:bookmarkStart w:id="12" w:name="_Toc232342777"/>
       <w:r>
         <w:t>Архитектура мобильного приложения</w:t>
       </w:r>
-      <w:bookmarkEnd w:id="11"/>
+      <w:bookmarkEnd w:id="12"/>
     </w:p>
     <w:p>
       <w:pPr>
@@ -2888,11 +3016,11 @@
       <w:pPr>
         <w:pStyle w:val="ad"/>
       </w:pPr>
-      <w:bookmarkStart w:id="12" w:name="_Toc232179716"/>
+      <w:bookmarkStart w:id="13" w:name="_Toc232342778"/>
       <w:r>
         <w:t>Этап 1 - Мобильный клиент (MVP)</w:t>
       </w:r>
-      <w:bookmarkEnd w:id="12"/>
+      <w:bookmarkEnd w:id="13"/>
     </w:p>
     <w:p>
       <w:pPr>
@@ -3027,11 +3155,11 @@
       <w:pPr>
         <w:pStyle w:val="ad"/>
       </w:pPr>
-      <w:bookmarkStart w:id="13" w:name="_Toc232179717"/>
+      <w:bookmarkStart w:id="14" w:name="_Toc232342779"/>
       <w:r>
         <w:t>Этап 2 - Автономная мобильная RAG-система (перспектива)</w:t>
       </w:r>
-      <w:bookmarkEnd w:id="13"/>
+      <w:bookmarkEnd w:id="14"/>
     </w:p>
     <w:p>
       <w:pPr>
@@ -3181,12 +3309,12 @@
       <w:pPr>
         <w:pStyle w:val="ac"/>
       </w:pPr>
-      <w:bookmarkStart w:id="14" w:name="_Toc232179718"/>
+      <w:bookmarkStart w:id="15" w:name="_Toc232342780"/>
       <w:r>
         <w:lastRenderedPageBreak/>
         <w:t>Заключение</w:t>
       </w:r>
-      <w:bookmarkEnd w:id="14"/>
+      <w:bookmarkEnd w:id="15"/>
     </w:p>
     <w:p>
       <w:pPr>
@@ -3250,12 +3378,12 @@
         <w:pStyle w:val="ac"/>
         <w:spacing w:before="240"/>
       </w:pPr>
-      <w:bookmarkStart w:id="15" w:name="_Toc232179719"/>
+      <w:bookmarkStart w:id="16" w:name="_Toc232342781"/>
       <w:r>
         <w:lastRenderedPageBreak/>
         <w:t>Список использованной литературы</w:t>
       </w:r>
-      <w:bookmarkEnd w:id="15"/>
+      <w:bookmarkEnd w:id="16"/>
     </w:p>
     <w:p>
       <w:pPr>

</xml_diff>